<commit_message>
Switched hyperparameter tuning of Decision Tree and Random Forest to GridSearchCV
</commit_message>
<xml_diff>
--- a/reports/Report - Potential Customers Prediction.docx
+++ b/reports/Report - Potential Customers Prediction.docx
@@ -487,6 +487,7 @@
     </w:p>
     <w:p>
       <w:pPr>
+        <w:keepNext/>
         <w:spacing w:before="200" w:after="80" w:line="276" w:lineRule="auto"/>
       </w:pPr>
       <w:r>
@@ -661,6 +662,7 @@
     </w:p>
     <w:p>
       <w:pPr>
+        <w:keepNext/>
         <w:spacing w:before="200" w:after="80" w:line="276" w:lineRule="auto"/>
       </w:pPr>
       <w:r>
@@ -779,7 +781,7 @@
           <w:i w:val="0"/>
           <w:sz w:val="22"/>
         </w:rPr>
-        <w:t xml:space="preserve"> Decision Tree and Random Forest, each built with default settings and then hyper-tuned with 5-fold cross-validation. Logistic Regression, Gradient Boosting and XGBoost were added as benchmarks.</w:t>
+        <w:t xml:space="preserve"> Decision Tree and Random Forest, each built with default settings and then hyper-tuned with GridSearchCV (every combination in a parameter grid, 5-fold cross-validation). Logistic Regression, Gradient Boosting and XGBoost were added as benchmarks.</w:t>
       </w:r>
     </w:p>
     <w:p>
@@ -1671,6 +1673,7 @@
     </w:p>
     <w:p>
       <w:pPr>
+        <w:keepNext/>
         <w:spacing w:before="120" w:after="60" w:line="276" w:lineRule="auto"/>
       </w:pPr>
       <w:r>
@@ -1782,6 +1785,7 @@
     </w:p>
     <w:p>
       <w:pPr>
+        <w:keepNext/>
         <w:spacing w:before="200" w:after="80" w:line="276" w:lineRule="auto"/>
       </w:pPr>
       <w:r>
@@ -2071,6 +2075,7 @@
     </w:p>
     <w:p>
       <w:pPr>
+        <w:keepNext/>
         <w:spacing w:before="200" w:after="80" w:line="276" w:lineRule="auto"/>
       </w:pPr>
       <w:r>
@@ -2223,6 +2228,7 @@
     </w:p>
     <w:p>
       <w:pPr>
+        <w:keepNext/>
         <w:spacing w:before="120" w:after="60" w:line="276" w:lineRule="auto"/>
       </w:pPr>
       <w:r>
@@ -2318,6 +2324,7 @@
     </w:p>
     <w:p>
       <w:pPr>
+        <w:keepNext/>
         <w:spacing w:before="120" w:after="60" w:line="276" w:lineRule="auto"/>
       </w:pPr>
       <w:r>
@@ -2422,6 +2429,7 @@
     </w:p>
     <w:p>
       <w:pPr>
+        <w:keepNext/>
         <w:spacing w:before="120" w:after="60" w:line="276" w:lineRule="auto"/>
       </w:pPr>
       <w:r>
@@ -2499,6 +2507,7 @@
     </w:p>
     <w:p>
       <w:pPr>
+        <w:keepNext/>
         <w:spacing w:before="120" w:after="60" w:line="276" w:lineRule="auto"/>
       </w:pPr>
       <w:r>
@@ -2594,6 +2603,7 @@
     </w:p>
     <w:p>
       <w:pPr>
+        <w:keepNext/>
         <w:spacing w:before="120" w:after="60" w:line="276" w:lineRule="auto"/>
       </w:pPr>
       <w:r>
@@ -2689,6 +2699,7 @@
     </w:p>
     <w:p>
       <w:pPr>
+        <w:keepNext/>
         <w:spacing w:before="200" w:after="80" w:line="276" w:lineRule="auto"/>
       </w:pPr>
       <w:r>
@@ -3045,6 +3056,7 @@
     </w:p>
     <w:p>
       <w:pPr>
+        <w:keepNext/>
         <w:spacing w:before="120" w:after="60" w:line="276" w:lineRule="auto"/>
       </w:pPr>
       <w:r>
@@ -3489,6 +3501,7 @@
     </w:p>
     <w:p>
       <w:pPr>
+        <w:keepNext/>
         <w:spacing w:before="120" w:after="60" w:line="276" w:lineRule="auto"/>
       </w:pPr>
       <w:r>
@@ -3790,6 +3803,7 @@
     </w:p>
     <w:p>
       <w:pPr>
+        <w:keepNext/>
         <w:spacing w:before="200" w:after="80" w:line="276" w:lineRule="auto"/>
       </w:pPr>
       <w:r>
@@ -4613,16 +4627,16 @@
           <w:i w:val="0"/>
           <w:sz w:val="22"/>
         </w:rPr>
-        <w:t>Tuning</w:t>
-      </w:r>
-      <w:r>
-        <w:rPr>
-          <w:rFonts w:ascii="Nunito" w:hAnsi="Nunito" w:cs="Nunito" w:eastAsia="Nunito"/>
-          <w:b w:val="0"/>
-          <w:i w:val="0"/>
-          <w:sz w:val="22"/>
-        </w:rPr>
-        <w:t xml:space="preserve"> (randomized search over depth, minimum leaf size and split criterion, scored by 5-fold CV ROC-AUC) selected </w:t>
+        <w:t>Tuning with GridSearchCV</w:t>
+      </w:r>
+      <w:r>
+        <w:rPr>
+          <w:rFonts w:ascii="Nunito" w:hAnsi="Nunito" w:cs="Nunito" w:eastAsia="Nunito"/>
+          <w:b w:val="0"/>
+          <w:i w:val="0"/>
+          <w:sz w:val="22"/>
+        </w:rPr>
+        <w:t xml:space="preserve"> evaluated all 100 combinations of max_depth (2 to 11), min_samples_leaf (1, 5, 10, 20, 40) and criterion (gini, entropy), each with 5-fold stratified CV scored on ROC-AUC. It selected </w:t>
       </w:r>
       <w:r>
         <w:rPr>
@@ -4640,7 +4654,7 @@
           <w:i w:val="0"/>
           <w:sz w:val="22"/>
         </w:rPr>
-        <w:t xml:space="preserve">. Train and test results are now close, test recall rises to </w:t>
+        <w:t xml:space="preserve"> (CV ROC-AUC 0.919). Train and test results are now close, test recall rises to </w:t>
       </w:r>
       <w:r>
         <w:rPr>
@@ -4659,6 +4673,33 @@
           <w:sz w:val="22"/>
         </w:rPr>
         <w:t>, and ROC-AUC rises from 0.74 to 0.91.</w:t>
+      </w:r>
+    </w:p>
+    <w:p>
+      <w:pPr>
+        <w:numPr>
+          <w:ilvl w:val="0"/>
+          <w:numId w:val="6"/>
+        </w:numPr>
+        <w:spacing w:before="0" w:after="60" w:line="276" w:lineRule="auto"/>
+      </w:pPr>
+      <w:r>
+        <w:rPr>
+          <w:rFonts w:ascii="Nunito" w:hAnsi="Nunito" w:cs="Nunito" w:eastAsia="Nunito"/>
+          <w:b/>
+          <w:i w:val="0"/>
+          <w:sz w:val="22"/>
+        </w:rPr>
+        <w:t>Why ROC-AUC as the tuning metric:</w:t>
+      </w:r>
+      <w:r>
+        <w:rPr>
+          <w:rFonts w:ascii="Nunito" w:hAnsi="Nunito" w:cs="Nunito" w:eastAsia="Nunito"/>
+          <w:b w:val="0"/>
+          <w:i w:val="0"/>
+          <w:sz w:val="22"/>
+        </w:rPr>
+        <w:t xml:space="preserve"> it rewards trees that rank converters above non-converters, and the cut-off is then set for recall. Scoring the grid on recall alone picks a depth-3 tree with recall 0.89 but precision only 0.58 and ROC-AUC 0.87, so it would flag many more leads that never convert.</w:t>
       </w:r>
     </w:p>
     <w:p>
@@ -4750,7 +4791,7 @@
               <a:graphicData uri="http://schemas.openxmlformats.org/drawingml/2006/picture">
                 <pic:pic>
                   <pic:nvPicPr>
-                    <pic:cNvPr id="0" name="c57_18.png"/>
+                    <pic:cNvPr id="0" name="c60_18.png"/>
                     <pic:cNvPicPr/>
                   </pic:nvPicPr>
                   <pic:blipFill>
@@ -4791,6 +4832,7 @@
     </w:p>
     <w:p>
       <w:pPr>
+        <w:keepNext/>
         <w:spacing w:before="200" w:after="80" w:line="276" w:lineRule="auto"/>
       </w:pPr>
       <w:r>
@@ -5334,7 +5376,7 @@
                 <w:i w:val="0"/>
                 <w:sz w:val="19"/>
               </w:rPr>
-              <w:t>0.857</w:t>
+              <w:t>0.870</w:t>
             </w:r>
           </w:p>
         </w:tc>
@@ -5355,7 +5397,7 @@
                 <w:i w:val="0"/>
                 <w:sz w:val="19"/>
               </w:rPr>
-              <w:t>0.895</w:t>
+              <w:t>0.908</w:t>
             </w:r>
           </w:p>
         </w:tc>
@@ -5376,7 +5418,7 @@
                 <w:i w:val="0"/>
                 <w:sz w:val="19"/>
               </w:rPr>
-              <w:t>0.706</w:t>
+              <w:t>0.725</w:t>
             </w:r>
           </w:p>
         </w:tc>
@@ -5397,7 +5439,7 @@
                 <w:i w:val="0"/>
                 <w:sz w:val="19"/>
               </w:rPr>
-              <w:t>0.789</w:t>
+              <w:t>0.806</w:t>
             </w:r>
           </w:p>
         </w:tc>
@@ -5418,7 +5460,7 @@
                 <w:i w:val="0"/>
                 <w:sz w:val="19"/>
               </w:rPr>
-              <w:t>0.951</w:t>
+              <w:t>0.962</w:t>
             </w:r>
           </w:p>
         </w:tc>
@@ -5468,7 +5510,7 @@
                 <w:i w:val="0"/>
                 <w:sz w:val="19"/>
               </w:rPr>
-              <w:t>0.832</w:t>
+              <w:t>0.837</w:t>
             </w:r>
           </w:p>
         </w:tc>
@@ -5489,7 +5531,7 @@
                 <w:i w:val="0"/>
                 <w:sz w:val="19"/>
               </w:rPr>
-              <w:t>0.850</w:t>
+              <w:t>0.840</w:t>
             </w:r>
           </w:p>
         </w:tc>
@@ -5510,7 +5552,7 @@
                 <w:i w:val="0"/>
                 <w:sz w:val="19"/>
               </w:rPr>
-              <w:t>0.674</w:t>
+              <w:t>0.686</w:t>
             </w:r>
           </w:p>
         </w:tc>
@@ -5531,7 +5573,7 @@
                 <w:i w:val="0"/>
                 <w:sz w:val="19"/>
               </w:rPr>
-              <w:t>0.752</w:t>
+              <w:t>0.755</w:t>
             </w:r>
           </w:p>
         </w:tc>
@@ -5614,52 +5656,34 @@
           <w:i w:val="0"/>
           <w:sz w:val="22"/>
         </w:rPr>
-        <w:t>Tuning</w:t>
-      </w:r>
-      <w:r>
-        <w:rPr>
-          <w:rFonts w:ascii="Nunito" w:hAnsi="Nunito" w:cs="Nunito" w:eastAsia="Nunito"/>
-          <w:b w:val="0"/>
-          <w:i w:val="0"/>
-          <w:sz w:val="22"/>
-        </w:rPr>
-        <w:t xml:space="preserve"> (number of trees, depth, leaf size, max_features and max_samples) selected </w:t>
-      </w:r>
-      <w:r>
-        <w:rPr>
-          <w:rFonts w:ascii="Nunito" w:hAnsi="Nunito" w:cs="Nunito" w:eastAsia="Nunito"/>
-          <w:b/>
-          <w:i w:val="0"/>
-          <w:sz w:val="22"/>
-        </w:rPr>
-        <w:t>500 trees, max_depth = 6, min_samples_leaf = 3, max_features = 0.5</w:t>
-      </w:r>
-      <w:r>
-        <w:rPr>
-          <w:rFonts w:ascii="Nunito" w:hAnsi="Nunito" w:cs="Nunito" w:eastAsia="Nunito"/>
-          <w:b w:val="0"/>
-          <w:i w:val="0"/>
-          <w:sz w:val="22"/>
-        </w:rPr>
-        <w:t xml:space="preserve">. Overfitting is controlled (recall 0.90 on train vs 0.85 on test), and the test ROC-AUC improves to </w:t>
-      </w:r>
-      <w:r>
-        <w:rPr>
-          <w:rFonts w:ascii="Nunito" w:hAnsi="Nunito" w:cs="Nunito" w:eastAsia="Nunito"/>
-          <w:b/>
-          <w:i w:val="0"/>
-          <w:sz w:val="22"/>
-        </w:rPr>
-        <w:t>0.925</w:t>
-      </w:r>
-      <w:r>
-        <w:rPr>
-          <w:rFonts w:ascii="Nunito" w:hAnsi="Nunito" w:cs="Nunito" w:eastAsia="Nunito"/>
-          <w:b w:val="0"/>
-          <w:i w:val="0"/>
-          <w:sz w:val="22"/>
-        </w:rPr>
-        <w:t>.</w:t>
+        <w:t>Tuning with GridSearchCV</w:t>
+      </w:r>
+      <w:r>
+        <w:rPr>
+          <w:rFonts w:ascii="Nunito" w:hAnsi="Nunito" w:cs="Nunito" w:eastAsia="Nunito"/>
+          <w:b w:val="0"/>
+          <w:i w:val="0"/>
+          <w:sz w:val="22"/>
+        </w:rPr>
+        <w:t xml:space="preserve"> evaluated all 96 combinations of n_estimators (200, 500), max_depth (4, 6, 8, none), min_samples_leaf (1, 3, 5, 10) and max_features (sqrt, 0.5, 0.7), with 5-fold stratified CV scored on ROC-AUC. It selected </w:t>
+      </w:r>
+      <w:r>
+        <w:rPr>
+          <w:rFonts w:ascii="Nunito" w:hAnsi="Nunito" w:cs="Nunito" w:eastAsia="Nunito"/>
+          <w:b/>
+          <w:i w:val="0"/>
+          <w:sz w:val="22"/>
+        </w:rPr>
+        <w:t>500 trees, max_depth = 8, min_samples_leaf = 3, max_features = sqrt</w:t>
+      </w:r>
+      <w:r>
+        <w:rPr>
+          <w:rFonts w:ascii="Nunito" w:hAnsi="Nunito" w:cs="Nunito" w:eastAsia="Nunito"/>
+          <w:b w:val="0"/>
+          <w:i w:val="0"/>
+          <w:sz w:val="22"/>
+        </w:rPr>
+        <w:t xml:space="preserve"> (CV ROC-AUC 0.929).</w:t>
       </w:r>
     </w:p>
     <w:p>
@@ -5677,7 +5701,115 @@
           <w:i w:val="0"/>
           <w:sz w:val="22"/>
         </w:rPr>
-        <w:t>Compared with the tuned Decision Tree, the forest has the same recall with better precision and a higher ROC-AUC.</w:t>
+        <w:t xml:space="preserve">The top five combinations score within 0.0005 of each other, much less than the fold-to-fold spread (about 0.007), so the forest is </w:t>
+      </w:r>
+      <w:r>
+        <w:rPr>
+          <w:rFonts w:ascii="Nunito" w:hAnsi="Nunito" w:cs="Nunito" w:eastAsia="Nunito"/>
+          <w:b/>
+          <w:i w:val="0"/>
+          <w:sz w:val="22"/>
+        </w:rPr>
+        <w:t>not sensitive to the exact settings</w:t>
+      </w:r>
+      <w:r>
+        <w:rPr>
+          <w:rFonts w:ascii="Nunito" w:hAnsi="Nunito" w:cs="Nunito" w:eastAsia="Nunito"/>
+          <w:b w:val="0"/>
+          <w:i w:val="0"/>
+          <w:sz w:val="22"/>
+        </w:rPr>
+        <w:t xml:space="preserve"> as long as its trees are depth-limited.</w:t>
+      </w:r>
+    </w:p>
+    <w:p>
+      <w:pPr>
+        <w:numPr>
+          <w:ilvl w:val="0"/>
+          <w:numId w:val="6"/>
+        </w:numPr>
+        <w:spacing w:before="0" w:after="60" w:line="276" w:lineRule="auto"/>
+      </w:pPr>
+      <w:r>
+        <w:rPr>
+          <w:rFonts w:ascii="Nunito" w:hAnsi="Nunito" w:cs="Nunito" w:eastAsia="Nunito"/>
+          <w:b w:val="0"/>
+          <w:i w:val="0"/>
+          <w:sz w:val="22"/>
+        </w:rPr>
+        <w:t xml:space="preserve">Overfitting is controlled (recall 0.91 on train vs 0.84 on test), and the test ROC-AUC improves from 0.916 to </w:t>
+      </w:r>
+      <w:r>
+        <w:rPr>
+          <w:rFonts w:ascii="Nunito" w:hAnsi="Nunito" w:cs="Nunito" w:eastAsia="Nunito"/>
+          <w:b/>
+          <w:i w:val="0"/>
+          <w:sz w:val="22"/>
+        </w:rPr>
+        <w:t>0.925</w:t>
+      </w:r>
+      <w:r>
+        <w:rPr>
+          <w:rFonts w:ascii="Nunito" w:hAnsi="Nunito" w:cs="Nunito" w:eastAsia="Nunito"/>
+          <w:b w:val="0"/>
+          <w:i w:val="0"/>
+          <w:sz w:val="22"/>
+        </w:rPr>
+        <w:t>.</w:t>
+      </w:r>
+    </w:p>
+    <w:p>
+      <w:pPr>
+        <w:numPr>
+          <w:ilvl w:val="0"/>
+          <w:numId w:val="6"/>
+        </w:numPr>
+        <w:spacing w:before="0" w:after="60" w:line="276" w:lineRule="auto"/>
+      </w:pPr>
+      <w:r>
+        <w:rPr>
+          <w:rFonts w:ascii="Nunito" w:hAnsi="Nunito" w:cs="Nunito" w:eastAsia="Nunito"/>
+          <w:b w:val="0"/>
+          <w:i w:val="0"/>
+          <w:sz w:val="22"/>
+        </w:rPr>
+        <w:t xml:space="preserve">Compared with the tuned Decision Tree, the forest has similar recall with </w:t>
+      </w:r>
+      <w:r>
+        <w:rPr>
+          <w:rFonts w:ascii="Nunito" w:hAnsi="Nunito" w:cs="Nunito" w:eastAsia="Nunito"/>
+          <w:b/>
+          <w:i w:val="0"/>
+          <w:sz w:val="22"/>
+        </w:rPr>
+        <w:t>higher precision (0.69 vs 0.65)</w:t>
+      </w:r>
+      <w:r>
+        <w:rPr>
+          <w:rFonts w:ascii="Nunito" w:hAnsi="Nunito" w:cs="Nunito" w:eastAsia="Nunito"/>
+          <w:b w:val="0"/>
+          <w:i w:val="0"/>
+          <w:sz w:val="22"/>
+        </w:rPr>
+        <w:t xml:space="preserve"> and a </w:t>
+      </w:r>
+      <w:r>
+        <w:rPr>
+          <w:rFonts w:ascii="Nunito" w:hAnsi="Nunito" w:cs="Nunito" w:eastAsia="Nunito"/>
+          <w:b/>
+          <w:i w:val="0"/>
+          <w:sz w:val="22"/>
+        </w:rPr>
+        <w:t>higher ROC-AUC (0.925 vs 0.911)</w:t>
+      </w:r>
+      <w:r>
+        <w:rPr>
+          <w:rFonts w:ascii="Nunito" w:hAnsi="Nunito" w:cs="Nunito" w:eastAsia="Nunito"/>
+          <w:b w:val="0"/>
+          <w:i w:val="0"/>
+          <w:sz w:val="22"/>
+        </w:rPr>
+        <w:t>, so fewer follow-ups are wasted.</w:t>
       </w:r>
     </w:p>
     <w:p>
@@ -5697,7 +5829,7 @@
               <a:graphicData uri="http://schemas.openxmlformats.org/drawingml/2006/picture">
                 <pic:pic>
                   <pic:nvPicPr>
-                    <pic:cNvPr id="0" name="c64_21.png"/>
+                    <pic:cNvPr id="0" name="c69_21.png"/>
                     <pic:cNvPicPr/>
                   </pic:nvPicPr>
                   <pic:blipFill>
@@ -5738,6 +5870,139 @@
     </w:p>
     <w:p>
       <w:pPr>
+        <w:keepNext/>
+        <w:spacing w:before="120" w:after="60" w:line="276" w:lineRule="auto"/>
+      </w:pPr>
+      <w:r>
+        <w:rPr>
+          <w:rFonts w:ascii="Nunito" w:hAnsi="Nunito" w:cs="Nunito" w:eastAsia="Nunito"/>
+          <w:b/>
+          <w:i w:val="0"/>
+          <w:sz w:val="24"/>
+        </w:rPr>
+        <w:t>Important features</w:t>
+      </w:r>
+    </w:p>
+    <w:p>
+      <w:pPr>
+        <w:numPr>
+          <w:ilvl w:val="0"/>
+          <w:numId w:val="6"/>
+        </w:numPr>
+        <w:spacing w:before="0" w:after="60" w:line="276" w:lineRule="auto"/>
+      </w:pPr>
+      <w:r>
+        <w:rPr>
+          <w:rFonts w:ascii="Nunito" w:hAnsi="Nunito" w:cs="Nunito" w:eastAsia="Nunito"/>
+          <w:b/>
+          <w:i w:val="0"/>
+          <w:sz w:val="22"/>
+        </w:rPr>
+        <w:t>First interaction via the Website (0.29)</w:t>
+      </w:r>
+      <w:r>
+        <w:rPr>
+          <w:rFonts w:ascii="Nunito" w:hAnsi="Nunito" w:cs="Nunito" w:eastAsia="Nunito"/>
+          <w:b w:val="0"/>
+          <w:i w:val="0"/>
+          <w:sz w:val="22"/>
+        </w:rPr>
+        <w:t xml:space="preserve"> and </w:t>
+      </w:r>
+      <w:r>
+        <w:rPr>
+          <w:rFonts w:ascii="Nunito" w:hAnsi="Nunito" w:cs="Nunito" w:eastAsia="Nunito"/>
+          <w:b/>
+          <w:i w:val="0"/>
+          <w:sz w:val="22"/>
+        </w:rPr>
+        <w:t>time spent on the website (0.29)</w:t>
+      </w:r>
+      <w:r>
+        <w:rPr>
+          <w:rFonts w:ascii="Nunito" w:hAnsi="Nunito" w:cs="Nunito" w:eastAsia="Nunito"/>
+          <w:b w:val="0"/>
+          <w:i w:val="0"/>
+          <w:sz w:val="22"/>
+        </w:rPr>
+        <w:t xml:space="preserve"> are jointly the strongest drivers, followed by </w:t>
+      </w:r>
+      <w:r>
+        <w:rPr>
+          <w:rFonts w:ascii="Nunito" w:hAnsi="Nunito" w:cs="Nunito" w:eastAsia="Nunito"/>
+          <w:b/>
+          <w:i w:val="0"/>
+          <w:sz w:val="22"/>
+        </w:rPr>
+        <w:t>profile completion (0.15)</w:t>
+      </w:r>
+      <w:r>
+        <w:rPr>
+          <w:rFonts w:ascii="Nunito" w:hAnsi="Nunito" w:cs="Nunito" w:eastAsia="Nunito"/>
+          <w:b w:val="0"/>
+          <w:i w:val="0"/>
+          <w:sz w:val="22"/>
+        </w:rPr>
+        <w:t>. Together they account for about three quarters of the forest's decisions, matching the Decision Tree and the EDA.</w:t>
+      </w:r>
+    </w:p>
+    <w:p>
+      <w:pPr>
+        <w:numPr>
+          <w:ilvl w:val="0"/>
+          <w:numId w:val="6"/>
+        </w:numPr>
+        <w:spacing w:before="0" w:after="60" w:line="276" w:lineRule="auto"/>
+      </w:pPr>
+      <w:r>
+        <w:rPr>
+          <w:rFonts w:ascii="Nunito" w:hAnsi="Nunito" w:cs="Nunito" w:eastAsia="Nunito"/>
+          <w:b w:val="0"/>
+          <w:i w:val="0"/>
+          <w:sz w:val="22"/>
+        </w:rPr>
+        <w:t>Age (0.06), page views per visit and last activity (phone lowers the chance, website activity raises it) add smaller refinements.</w:t>
+      </w:r>
+    </w:p>
+    <w:p>
+      <w:pPr>
+        <w:numPr>
+          <w:ilvl w:val="0"/>
+          <w:numId w:val="6"/>
+        </w:numPr>
+        <w:spacing w:before="0" w:after="60" w:line="276" w:lineRule="auto"/>
+      </w:pPr>
+      <w:r>
+        <w:rPr>
+          <w:rFonts w:ascii="Nunito" w:hAnsi="Nunito" w:cs="Nunito" w:eastAsia="Nunito"/>
+          <w:b w:val="0"/>
+          <w:i w:val="0"/>
+          <w:sz w:val="22"/>
+        </w:rPr>
+        <w:t>The advertising flags and referral carry almost no importance. Referral converts well but covers only 2% of leads, so it rarely changes a prediction.</w:t>
+      </w:r>
+    </w:p>
+    <w:p>
+      <w:pPr>
+        <w:numPr>
+          <w:ilvl w:val="0"/>
+          <w:numId w:val="6"/>
+        </w:numPr>
+        <w:spacing w:before="0" w:after="60" w:line="276" w:lineRule="auto"/>
+      </w:pPr>
+      <w:r>
+        <w:rPr>
+          <w:rFonts w:ascii="Nunito" w:hAnsi="Nunito" w:cs="Nunito" w:eastAsia="Nunito"/>
+          <w:b w:val="0"/>
+          <w:i w:val="0"/>
+          <w:sz w:val="22"/>
+        </w:rPr>
+        <w:t>Because each tree sees a random subset of features at each split, the forest spreads some importance across secondary features, which makes it more robust than a single tree.</w:t>
+      </w:r>
+    </w:p>
+    <w:p>
+      <w:pPr>
+        <w:keepNext/>
         <w:spacing w:before="200" w:after="80" w:line="276" w:lineRule="auto"/>
       </w:pPr>
       <w:r>
@@ -5855,6 +6120,7 @@
     </w:p>
     <w:p>
       <w:pPr>
+        <w:keepNext/>
         <w:spacing w:before="200" w:after="80" w:line="276" w:lineRule="auto"/>
       </w:pPr>
       <w:r>
@@ -6110,7 +6376,7 @@
                 <w:i w:val="0"/>
                 <w:sz w:val="18"/>
               </w:rPr>
-              <w:t>0.890</w:t>
+              <w:t>0.907</w:t>
             </w:r>
           </w:p>
         </w:tc>
@@ -7126,7 +7392,7 @@
               <a:graphicData uri="http://schemas.openxmlformats.org/drawingml/2006/picture">
                 <pic:pic>
                   <pic:nvPicPr>
-                    <pic:cNvPr id="0" name="c72_22.png"/>
+                    <pic:cNvPr id="0" name="c77_22.png"/>
                     <pic:cNvPicPr/>
                   </pic:nvPicPr>
                   <pic:blipFill>
@@ -7275,6 +7541,7 @@
     </w:p>
     <w:p>
       <w:pPr>
+        <w:keepNext/>
         <w:spacing w:before="200" w:after="80" w:line="276" w:lineRule="auto"/>
       </w:pPr>
       <w:r>
@@ -7676,7 +7943,7 @@
                 <w:i w:val="0"/>
                 <w:sz w:val="19"/>
               </w:rPr>
-              <w:t>0.9285</w:t>
+              <w:t>0.9281</w:t>
             </w:r>
           </w:p>
         </w:tc>
@@ -7738,7 +8005,7 @@
                 <w:i w:val="0"/>
                 <w:sz w:val="19"/>
               </w:rPr>
-              <w:t>8 of 15</w:t>
+              <w:t>9 of 15</w:t>
             </w:r>
           </w:p>
         </w:tc>
@@ -7759,7 +8026,7 @@
                 <w:i w:val="0"/>
                 <w:sz w:val="19"/>
               </w:rPr>
-              <w:t>7 of 15</w:t>
+              <w:t>6 of 15</w:t>
             </w:r>
           </w:p>
         </w:tc>
@@ -7794,16 +8061,16 @@
           <w:i w:val="0"/>
           <w:sz w:val="22"/>
         </w:rPr>
-        <w:t>-0.0003</w:t>
-      </w:r>
-      <w:r>
-        <w:rPr>
-          <w:rFonts w:ascii="Nunito" w:hAnsi="Nunito" w:cs="Nunito" w:eastAsia="Nunito"/>
-          <w:b w:val="0"/>
-          <w:i w:val="0"/>
-          <w:sz w:val="22"/>
-        </w:rPr>
-        <w:t xml:space="preserve">. The fold-to-fold variation in that difference (±0.0026) is about nine times larger, so the two models are </w:t>
+        <w:t>0.0000</w:t>
+      </w:r>
+      <w:r>
+        <w:rPr>
+          <w:rFonts w:ascii="Nunito" w:hAnsi="Nunito" w:cs="Nunito" w:eastAsia="Nunito"/>
+          <w:b w:val="0"/>
+          <w:i w:val="0"/>
+          <w:sz w:val="22"/>
+        </w:rPr>
+        <w:t xml:space="preserve">. The fold-to-fold variation in that difference (±0.0023) is far larger than the gap, so the two models are </w:t>
       </w:r>
       <w:r>
         <w:rPr>
@@ -7886,7 +8153,7 @@
               <a:graphicData uri="http://schemas.openxmlformats.org/drawingml/2006/picture">
                 <pic:pic>
                   <pic:nvPicPr>
-                    <pic:cNvPr id="0" name="c78_25.png"/>
+                    <pic:cNvPr id="0" name="c83_25.png"/>
                     <pic:cNvPicPr/>
                   </pic:nvPicPr>
                   <pic:blipFill>
@@ -7927,6 +8194,7 @@
     </w:p>
     <w:p>
       <w:pPr>
+        <w:keepNext/>
         <w:spacing w:before="200" w:after="80" w:line="276" w:lineRule="auto"/>
       </w:pPr>
       <w:r>
@@ -7969,7 +8237,7 @@
           <w:i w:val="0"/>
           <w:sz w:val="22"/>
         </w:rPr>
-        <w:t xml:space="preserve"> (threshold 0.54) is chosen as the final model:</w:t>
+        <w:t xml:space="preserve"> (threshold 0.50) is chosen as the final model:</w:t>
       </w:r>
     </w:p>
     <w:p>
@@ -8169,7 +8437,7 @@
               <a:graphicData uri="http://schemas.openxmlformats.org/drawingml/2006/picture">
                 <pic:pic>
                   <pic:nvPicPr>
-                    <pic:cNvPr id="0" name="c81_26.png"/>
+                    <pic:cNvPr id="0" name="c86_26.png"/>
                     <pic:cNvPicPr/>
                   </pic:nvPicPr>
                   <pic:blipFill>
@@ -8242,6 +8510,7 @@
     </w:p>
     <w:p>
       <w:pPr>
+        <w:keepNext/>
         <w:spacing w:before="200" w:after="80" w:line="276" w:lineRule="auto"/>
       </w:pPr>
       <w:r>
@@ -8263,7 +8532,7 @@
       <w:r>
         <w:drawing>
           <wp:inline>
-            <wp:extent cx="4754880" cy="2865808"/>
+            <wp:extent cx="4754880" cy="2872292"/>
             <wp:docPr id="15" name="Picture 15"/>
             <wp:cNvGraphicFramePr>
               <a:graphicFrameLocks noChangeAspect="1"/>
@@ -8272,7 +8541,7 @@
               <a:graphicData uri="http://schemas.openxmlformats.org/drawingml/2006/picture">
                 <pic:pic>
                   <pic:nvPicPr>
-                    <pic:cNvPr id="0" name="c82_27.png"/>
+                    <pic:cNvPr id="0" name="c87_27.png"/>
                     <pic:cNvPicPr/>
                   </pic:nvPicPr>
                   <pic:blipFill>
@@ -8284,7 +8553,7 @@
                   <pic:spPr>
                     <a:xfrm>
                       <a:off x="0" y="0"/>
-                      <a:ext cx="4754880" cy="2865808"/>
+                      <a:ext cx="4754880" cy="2872292"/>
                     </a:xfrm>
                     <a:prstGeom prst="rect"/>
                   </pic:spPr>
@@ -8421,6 +8690,7 @@
     </w:p>
     <w:p>
       <w:pPr>
+        <w:keepNext/>
         <w:spacing w:before="200" w:after="80" w:line="276" w:lineRule="auto"/>
       </w:pPr>
       <w:r>
@@ -8691,7 +8961,7 @@
                 <w:i w:val="0"/>
                 <w:sz w:val="19"/>
               </w:rPr>
-              <w:t>648</w:t>
+              <w:t>653</w:t>
             </w:r>
           </w:p>
         </w:tc>
@@ -8712,7 +8982,7 @@
                 <w:i w:val="0"/>
                 <w:sz w:val="19"/>
               </w:rPr>
-              <w:t>315</w:t>
+              <w:t>314</w:t>
             </w:r>
           </w:p>
         </w:tc>
@@ -9187,6 +9457,7 @@
     </w:p>
     <w:p>
       <w:pPr>
+        <w:keepNext/>
         <w:spacing w:before="200" w:after="80" w:line="276" w:lineRule="auto"/>
       </w:pPr>
       <w:r>
@@ -9445,6 +9716,7 @@
     </w:p>
     <w:p>
       <w:pPr>
+        <w:keepNext/>
         <w:spacing w:before="200" w:after="80" w:line="276" w:lineRule="auto"/>
       </w:pPr>
       <w:r>
@@ -9629,6 +9901,7 @@
     </w:p>
     <w:p>
       <w:pPr>
+        <w:keepNext/>
         <w:spacing w:before="200" w:after="80" w:line="276" w:lineRule="auto"/>
       </w:pPr>
       <w:r>
@@ -9659,7 +9932,7 @@
               <a:graphicData uri="http://schemas.openxmlformats.org/drawingml/2006/picture">
                 <pic:pic>
                   <pic:nvPicPr>
-                    <pic:cNvPr id="0" name="c55_17.png"/>
+                    <pic:cNvPr id="0" name="c58_17.png"/>
                     <pic:cNvPicPr/>
                   </pic:nvPicPr>
                   <pic:blipFill>
@@ -9684,6 +9957,7 @@
     </w:p>
     <w:p>
       <w:pPr>
+        <w:keepNext/>
         <w:spacing w:before="120" w:after="60" w:line="276" w:lineRule="auto"/>
       </w:pPr>
       <w:r>
@@ -9779,6 +10053,7 @@
     </w:p>
     <w:p>
       <w:pPr>
+        <w:keepNext/>
         <w:spacing w:before="200" w:after="80" w:line="276" w:lineRule="auto"/>
       </w:pPr>
       <w:r>
@@ -10785,6 +11060,7 @@
     </w:p>
     <w:p>
       <w:pPr>
+        <w:keepNext/>
         <w:spacing w:before="200" w:after="80" w:line="276" w:lineRule="auto"/>
       </w:pPr>
       <w:r>
@@ -10988,7 +11264,7 @@
                 <w:i w:val="0"/>
                 <w:sz w:val="18"/>
               </w:rPr>
-              <w:t>n_estimators=500, max_depth=6, min_samples_leaf=3, max_features=0.5, class_weight=balanced</w:t>
+              <w:t>n_estimators=500, max_depth=8, min_samples_leaf=3, max_features=sqrt, class_weight=balanced</w:t>
             </w:r>
           </w:p>
         </w:tc>
@@ -11010,7 +11286,7 @@
                 <w:i w:val="0"/>
                 <w:sz w:val="18"/>
               </w:rPr>
-              <w:t>0.542</w:t>
+              <w:t>0.503</w:t>
             </w:r>
           </w:p>
         </w:tc>
@@ -11208,6 +11484,7 @@
     </w:p>
     <w:p>
       <w:pPr>
+        <w:keepNext/>
         <w:spacing w:before="200" w:after="80" w:line="276" w:lineRule="auto"/>
       </w:pPr>
       <w:r>
@@ -11294,7 +11571,7 @@
               <a:graphicData uri="http://schemas.openxmlformats.org/drawingml/2006/picture">
                 <pic:pic>
                   <pic:nvPicPr>
-                    <pic:cNvPr id="0" name="c76_24.png"/>
+                    <pic:cNvPr id="0" name="c81_24.png"/>
                     <pic:cNvPicPr/>
                   </pic:nvPicPr>
                   <pic:blipFill>
@@ -11330,7 +11607,7 @@
           <w:color w:val="555555"/>
           <w:sz w:val="18"/>
         </w:rPr>
-        <w:t>Tuned Random Forest at the 0.54 threshold: confusion matrices</w:t>
+        <w:t>Tuned Random Forest at the 0.50 threshold: confusion matrices</w:t>
       </w:r>
     </w:p>
     <w:p>
@@ -11350,7 +11627,7 @@
               <a:graphicData uri="http://schemas.openxmlformats.org/drawingml/2006/picture">
                 <pic:pic>
                   <pic:nvPicPr>
-                    <pic:cNvPr id="0" name="c75_23.png"/>
+                    <pic:cNvPr id="0" name="c80_23.png"/>
                     <pic:cNvPicPr/>
                   </pic:nvPicPr>
                   <pic:blipFill>
@@ -11391,6 +11668,7 @@
     </w:p>
     <w:p>
       <w:pPr>
+        <w:keepNext/>
         <w:spacing w:before="200" w:after="80" w:line="276" w:lineRule="auto"/>
       </w:pPr>
       <w:r>
@@ -11473,7 +11751,7 @@
           <w:i w:val="0"/>
           <w:sz w:val="22"/>
         </w:rPr>
-        <w:t>Hyperparameters were tuned with RandomizedSearchCV (40 candidates, 5-fold stratified CV, ROC-AUC). Thresholds were set from out-of-fold training predictions, and the test set was used only for the final evaluation.</w:t>
+        <w:t>The Decision Tree (100 combinations) and Random Forest (96 combinations) were tuned with GridSearchCV; the benchmark models (Logistic Regression, Gradient Boosting, XGBoost) with RandomizedSearchCV (40 candidates). All used 5-fold stratified CV scored on ROC-AUC. Thresholds were set from out-of-fold training predictions, and the test set was used only for the final evaluation.</w:t>
       </w:r>
     </w:p>
     <w:sectPr>

</xml_diff>